<commit_message>
Marilyn Monroe: reescreve gancho da Parte 1
Co-Authored-By: Claude Opus 5.5 <noreply@anthropic.com>
Claude-Session: https://claude.ai/code/session_01MJjUEEZrxQDEUifKK2vj9g
</commit_message>
<xml_diff>
--- a/roteiros/marilyn-monroe/MarilynMonroe_Parte1_Introducao.docx
+++ b/roteiros/marilyn-monroe/MarilynMonroe_Parte1_Introducao.docx
@@ -15,7 +15,7 @@
         <w:rPr>
           <w:color w:val="C00000"/>
         </w:rPr>
-        <w:t>Marilyn Monroe foi a mulher mais desejada do planeta. E morreu sozinha, aos trinta e seis anos, atrás de uma porta trancada.</w:t>
+        <w:t>Marilyn Monroe foi encontrada morta, sozinha no quarto, com um telefone apertado na mão. E até hoje ninguém sabe para quem ela tentou ligar nos últimos minutos de vida.</w:t>
       </w:r>
     </w:p>
     <w:p>
@@ -23,7 +23,7 @@
         <w:rPr>
           <w:color w:val="C00000"/>
         </w:rPr>
-        <w:t>O que pouca gente sabe é que a exploração dela não terminou naquela noite. O que fizeram com o corpo, com a imagem e com o nome dela depois do enterro é ainda mais repugnante do que o que fizeram em vida.</w:t>
+        <w:t>O que pouca gente sabe é que um homem ficou rico usando o corpo dela sem pagar nada. E, quando ela morreu, ele fez uma coisa ainda mais repugnante.</w:t>
       </w:r>
     </w:p>
     <w:p>
@@ -31,7 +31,7 @@
         <w:rPr>
           <w:color w:val="C00000"/>
         </w:rPr>
-        <w:t>Fique até o final, porque você vai descobrir quem está enterrado a poucos centímetros dela. E por que esse homem escolheu exatamente aquele lugar.</w:t>
+        <w:t>Fique até o final, porque você vai descobrir quem é esse homem. E o que ele fez para passar a eternidade ao lado dela.</w:t>
       </w:r>
     </w:p>
     <w:p>
@@ -39,7 +39,7 @@
         <w:rPr>
           <w:color w:val="000000"/>
         </w:rPr>
-        <w:t>Mas, antes de chegar a esse túmulo, é preciso entrar numa casa de Los Angeles, na madrugada em que tudo terminou.</w:t>
+        <w:t>Mas, para chegar a esse homem, é preciso entrar primeiro numa casa de Los Angeles, na madrugada em que tudo terminou.</w:t>
       </w:r>
     </w:p>
     <w:p>

</xml_diff>

<commit_message>
Marilyn Monroe: gancho mais direto e natural
Co-Authored-By: Claude Opus 5.5 <noreply@anthropic.com>
Claude-Session: https://claude.ai/code/session_01MJjUEEZrxQDEUifKK2vj9g
</commit_message>
<xml_diff>
--- a/roteiros/marilyn-monroe/MarilynMonroe_Parte1_Introducao.docx
+++ b/roteiros/marilyn-monroe/MarilynMonroe_Parte1_Introducao.docx
@@ -15,7 +15,7 @@
         <w:rPr>
           <w:color w:val="C00000"/>
         </w:rPr>
-        <w:t>Marilyn Monroe foi encontrada morta, sozinha no quarto, com um telefone apertado na mão. E até hoje ninguém sabe para quem ela tentou ligar nos últimos minutos de vida.</w:t>
+        <w:t>Marilyn Monroe morreu sozinha, segurando um telefone. E até hoje ninguém sabe para quem ela tentou ligar.</w:t>
       </w:r>
     </w:p>
     <w:p>
@@ -23,7 +23,7 @@
         <w:rPr>
           <w:color w:val="C00000"/>
         </w:rPr>
-        <w:t>O que pouca gente sabe é que um homem ficou rico usando o corpo dela sem pagar nada a ela. E, depois que ela morreu, ele fez uma coisa ainda mais repugnante.</w:t>
+        <w:t>O que pouca gente sabe é que um homem ficou rico com o corpo dela. E ela nunca recebeu nada.</w:t>
       </w:r>
     </w:p>
     <w:p>
@@ -31,7 +31,7 @@
         <w:rPr>
           <w:color w:val="C00000"/>
         </w:rPr>
-        <w:t>Fique até o final, porque você vai descobrir quem é esse homem. E o que ele fez para passar a eternidade ao lado dela.</w:t>
+        <w:t>Fique até o final, porque você vai descobrir o que esse homem fez depois que ela morreu. Uma coisa tão repugnante que parece mentira.</w:t>
       </w:r>
     </w:p>
     <w:p>
@@ -39,7 +39,7 @@
         <w:rPr>
           <w:color w:val="000000"/>
         </w:rPr>
-        <w:t>Mas, para chegar a esse homem, é preciso entrar primeiro numa casa de Los Angeles, na madrugada em que tudo terminou.</w:t>
+        <w:t>Essa história começa numa madrugada de agosto, dentro de uma casa em Los Angeles.</w:t>
       </w:r>
     </w:p>
     <w:p>

</xml_diff>

<commit_message>
Marilyn Monroe: novo gancho centrado no túmulo
Co-Authored-By: Claude Opus 5.5 <noreply@anthropic.com>
Claude-Session: https://claude.ai/code/session_01MJjUEEZrxQDEUifKK2vj9g
</commit_message>
<xml_diff>
--- a/roteiros/marilyn-monroe/MarilynMonroe_Parte1_Introducao.docx
+++ b/roteiros/marilyn-monroe/MarilynMonroe_Parte1_Introducao.docx
@@ -15,7 +15,7 @@
         <w:rPr>
           <w:color w:val="C00000"/>
         </w:rPr>
-        <w:t>Marilyn Monroe morreu sozinha, segurando um telefone. E até hoje ninguém sabe para quem ela tentou ligar.</w:t>
+        <w:t>Marilyn Monroe foi a mulher mais desejada do mundo. E morreu sozinha, trancada num quarto, aos trinta e seis anos.</w:t>
       </w:r>
     </w:p>
     <w:p>
@@ -23,7 +23,7 @@
         <w:rPr>
           <w:color w:val="C00000"/>
         </w:rPr>
-        <w:t>O que pouca gente sabe é que, ainda em vida, ela viu um homem ficar rico com fotos do corpo dela. E não viu um centavo desse dinheiro.</w:t>
+        <w:t>Anos depois, um homem que ficou milionário com fotos íntimas dela comprou o túmulo ao lado. E disse que passar a eternidade colado em Marilyn era bom demais para deixar passar.</w:t>
       </w:r>
     </w:p>
     <w:p>
@@ -31,7 +31,7 @@
         <w:rPr>
           <w:color w:val="C00000"/>
         </w:rPr>
-        <w:t>Fique até o final, porque você vai descobrir o que esse homem fez depois que ela morreu. Uma coisa tão repugnante que parece mentira.</w:t>
+        <w:t>Fique até o final, porque você vai descobrir quem é esse homem. E o que ele fez com ela enquanto ela ainda estava viva.</w:t>
       </w:r>
     </w:p>
     <w:p>
@@ -39,7 +39,7 @@
         <w:rPr>
           <w:color w:val="000000"/>
         </w:rPr>
-        <w:t>Essa história começa numa madrugada de agosto, dentro de uma casa em Los Angeles.</w:t>
+        <w:t>Mas, para entender essa história, é preciso voltar à madrugada em que ela morreu.</w:t>
       </w:r>
     </w:p>
     <w:p>

</xml_diff>

<commit_message>
Marilyn Monroe: gancho focado na vida dela
Co-Authored-By: Claude Opus 5.5 <noreply@anthropic.com>
Claude-Session: https://claude.ai/code/session_01MJjUEEZrxQDEUifKK2vj9g
</commit_message>
<xml_diff>
--- a/roteiros/marilyn-monroe/MarilynMonroe_Parte1_Introducao.docx
+++ b/roteiros/marilyn-monroe/MarilynMonroe_Parte1_Introducao.docx
@@ -15,7 +15,7 @@
         <w:rPr>
           <w:color w:val="C00000"/>
         </w:rPr>
-        <w:t>Marilyn Monroe foi a mulher mais desejada do mundo. E morreu sozinha, trancada num quarto, aos trinta e seis anos.</w:t>
+        <w:t>Marilyn Monroe foi a mulher mais desejada do mundo. Mas, por trás daquele sorriso, existia uma menina que ninguém nunca quis.</w:t>
       </w:r>
     </w:p>
     <w:p>
@@ -23,7 +23,7 @@
         <w:rPr>
           <w:color w:val="C00000"/>
         </w:rPr>
-        <w:t>Anos depois, um homem que ficou milionário com fotos íntimas dela comprou o túmulo ao lado. E disse que passar a eternidade colado em Marilyn era bom demais para deixar passar.</w:t>
+        <w:t>A mãe dela terminou num hospício, e o pai se recusou a conhecê-la. Anos depois, já famosa, foi ela quem acabou trancada num quarto de hospital psiquiátrico, batendo na porta e implorando para sair.</w:t>
       </w:r>
     </w:p>
     <w:p>
@@ -31,7 +31,7 @@
         <w:rPr>
           <w:color w:val="C00000"/>
         </w:rPr>
-        <w:t>Fique até o final, porque você vai descobrir quem é esse homem. E o que ele fez com ela enquanto ela ainda estava viva.</w:t>
+        <w:t>Fique até o final, porque você vai descobrir o que fizeram com ela nos últimos anos de vida. E o segredo repugnante que Hollywood enterrou junto com ela.</w:t>
       </w:r>
     </w:p>
     <w:p>
@@ -39,7 +39,7 @@
         <w:rPr>
           <w:color w:val="000000"/>
         </w:rPr>
-        <w:t>Mas, para entender essa história, é preciso voltar à madrugada em que ela morreu.</w:t>
+        <w:t>Mas essa história começa pelo fim. Pela madrugada em que ela morreu.</w:t>
       </w:r>
     </w:p>
     <w:p>

</xml_diff>

<commit_message>
Marilyn Monroe: gancho sobre o lado sombrio da vida dela
Co-Authored-By: Claude Opus 5.5 <noreply@anthropic.com>
Claude-Session: https://claude.ai/code/session_01MJjUEEZrxQDEUifKK2vj9g
</commit_message>
<xml_diff>
--- a/roteiros/marilyn-monroe/MarilynMonroe_Parte1_Introducao.docx
+++ b/roteiros/marilyn-monroe/MarilynMonroe_Parte1_Introducao.docx
@@ -15,7 +15,7 @@
         <w:rPr>
           <w:color w:val="C00000"/>
         </w:rPr>
-        <w:t>Marilyn Monroe foi a mulher mais desejada do mundo. Mas, por trás daquele sorriso, existia uma menina que ninguém nunca quis.</w:t>
+        <w:t>Marilyn Monroe foi a mulher mais desejada do mundo. E, segundo ela mesma contava, quando ainda era um bebê de pouco mais de um ano, alguém da própria família tentou sufocá-la com um travesseiro.</w:t>
       </w:r>
     </w:p>
     <w:p>
@@ -23,7 +23,7 @@
         <w:rPr>
           <w:color w:val="C00000"/>
         </w:rPr>
-        <w:t>A mãe dela terminou num hospício, e o pai se recusou a conhecê-la. Anos depois, já famosa, foi ela quem acabou trancada num quarto de hospital psiquiátrico, batendo na porta e implorando para sair.</w:t>
+        <w:t>Adulta, ela vivia à base de remédios para dormir e champanhe. E, muito antes daquela última noite, já tinha chegado perto de não acordar mais de uma vez.</w:t>
       </w:r>
     </w:p>
     <w:p>
@@ -31,7 +31,7 @@
         <w:rPr>
           <w:color w:val="C00000"/>
         </w:rPr>
-        <w:t>Fique até o final, porque você vai descobrir o que fizeram com ela nos últimos anos de vida. E o segredo repugnante que Hollywood enterrou junto com ela.</w:t>
+        <w:t>Fique até o final, porque você vai descobrir o lado da Marilyn que Hollywood escondeu. E o segredo repugnante que enterraram junto com ela.</w:t>
       </w:r>
     </w:p>
     <w:p>
@@ -232,6 +232,30 @@
           <w:color w:val="000000"/>
         </w:rPr>
         <w:t>A mãe visitava nos fins de semana. Mas não conseguia cuidar da filha.</w:t>
+      </w:r>
+    </w:p>
+    <w:p>
+      <w:r>
+        <w:rPr>
+          <w:color w:val="000000"/>
+        </w:rPr>
+        <w:t>Do outro lado da rua morava a avó materna, Della Monroe. Uma mulher instável, que em pouco tempo também seria internada num hospital psiquiátrico e morreria lá dentro.</w:t>
+      </w:r>
+    </w:p>
+    <w:p>
+      <w:r>
+        <w:rPr>
+          <w:color w:val="000000"/>
+        </w:rPr>
+        <w:t>Anos depois, já famosa, Marilyn contou uma lembrança que nunca saiu da cabeça dela. Disse que, quando tinha pouco mais de um ano, acordou sem ar, com um travesseiro pressionado contra o rosto. Segundo ela, era a avó.</w:t>
+      </w:r>
+    </w:p>
+    <w:p>
+      <w:r>
+        <w:rPr>
+          <w:color w:val="000000"/>
+        </w:rPr>
+        <w:t>Ninguém nunca conseguiu provar. Mas ela carregou essa memória pelo resto da vida.</w:t>
       </w:r>
     </w:p>
     <w:p>

</xml_diff>

<commit_message>
Marilyn Monroe: gancho mais curto e vago
Co-Authored-By: Claude Opus 5.5 <noreply@anthropic.com>
Claude-Session: https://claude.ai/code/session_01MJjUEEZrxQDEUifKK2vj9g
</commit_message>
<xml_diff>
--- a/roteiros/marilyn-monroe/MarilynMonroe_Parte1_Introducao.docx
+++ b/roteiros/marilyn-monroe/MarilynMonroe_Parte1_Introducao.docx
@@ -15,7 +15,7 @@
         <w:rPr>
           <w:color w:val="C00000"/>
         </w:rPr>
-        <w:t>Marilyn Monroe foi a mulher mais desejada do mundo. E, segundo ela mesma contava, quando ainda era um bebê de pouco mais de um ano, alguém da própria família tentou sufocá-la com um travesseiro.</w:t>
+        <w:t>Marilyn Monroe foi a mulher mais desejada do mundo. E, segundo ela, antes mesmo de aprender a andar, alguém da própria família tentou matá-la.</w:t>
       </w:r>
     </w:p>
     <w:p>
@@ -23,7 +23,7 @@
         <w:rPr>
           <w:color w:val="C00000"/>
         </w:rPr>
-        <w:t>Adulta, ela vivia à base de remédios para dormir e champanhe. E, muito antes daquela última noite, já tinha chegado perto de não acordar mais de uma vez.</w:t>
+        <w:t>O que pouca gente sabe é que essa foi só a primeira vez que ela chegou perto da morte.</w:t>
       </w:r>
     </w:p>
     <w:p>

</xml_diff>

<commit_message>
Marilyn Monroe: revisão crítica da Parte 1
Co-Authored-By: Claude Opus 5.5 <noreply@anthropic.com>
Claude-Session: https://claude.ai/code/session_01MJjUEEZrxQDEUifKK2vj9g
</commit_message>
<xml_diff>
--- a/roteiros/marilyn-monroe/MarilynMonroe_Parte1_Introducao.docx
+++ b/roteiros/marilyn-monroe/MarilynMonroe_Parte1_Introducao.docx
@@ -15,7 +15,7 @@
         <w:rPr>
           <w:color w:val="C00000"/>
         </w:rPr>
-        <w:t>Marilyn Monroe foi a mulher mais desejada do mundo. E, segundo ela, antes mesmo de aprender a andar, alguém da própria família tentou matá-la.</w:t>
+        <w:t>Marilyn Monroe foi a mulher mais desejada do mundo. E, segundo ela, quando ainda era um bebê, alguém da própria família tentou matá-la.</w:t>
       </w:r>
     </w:p>
     <w:p>
@@ -159,7 +159,7 @@
         <w:rPr>
           <w:color w:val="000000"/>
         </w:rPr>
-        <w:t>O mundo parou. A mulher mais fotografada do século tinha morrido sozinha, numa casa que tinha acabado de comprar, com apenas trinta e seis anos.</w:t>
+        <w:t>A mulher mais fotografada do século tinha morrido sozinha, aos trinta e seis anos, na primeira casa que comprou na vida.</w:t>
       </w:r>
     </w:p>
     <w:p>
@@ -167,7 +167,7 @@
         <w:rPr>
           <w:color w:val="000000"/>
         </w:rPr>
-        <w:t>Só que, para entender como a estrela mais desejada de Hollywood terminou aquela noite sozinha, com um telefone na mão, é preciso voltar trinta e seis anos no tempo.</w:t>
+        <w:t>Para entender como a estrela mais desejada de Hollywood terminou aquela noite com um telefone na mão, é preciso voltar ao começo.</w:t>
       </w:r>
     </w:p>
     <w:p>
@@ -215,7 +215,7 @@
         <w:rPr>
           <w:color w:val="C00000"/>
         </w:rPr>
-        <w:t>Esse homem que se recusou a ser pai ia carregar um segredo por toda a vida. Um segredo que só foi confirmado sessenta anos depois da morte de Marilyn, graças a um fio de cabelo guardado no dia em que ela morreu.</w:t>
+        <w:t>Esse homem que se recusou a ser pai ia carregar um segredo por toda a vida. Um segredo que só foi confirmado sessenta anos depois da morte de Marilyn, graças a um fio de cabelo dela.</w:t>
       </w:r>
     </w:p>
     <w:p>
@@ -255,7 +255,7 @@
         <w:rPr>
           <w:color w:val="000000"/>
         </w:rPr>
-        <w:t>Ninguém nunca conseguiu provar. Mas ela carregou essa memória pelo resto da vida.</w:t>
+        <w:t>Nunca houve prova. Ela carregou essa lembrança pelo resto da vida.</w:t>
       </w:r>
     </w:p>
     <w:p>
@@ -343,7 +343,7 @@
         <w:rPr>
           <w:color w:val="000000"/>
         </w:rPr>
-        <w:t>Depois do orfanato, vieram outros lares temporários, outras famílias, outras camas.</w:t>
+        <w:t>Depois do orfanato, vieram outros lares temporários e outras famílias.</w:t>
       </w:r>
     </w:p>
     <w:p>
@@ -359,7 +359,7 @@
         <w:rPr>
           <w:color w:val="000000"/>
         </w:rPr>
-        <w:t>Uma menina sem pai, com a mãe internada, passada de casa em casa. E sem ninguém para protegê-la.</w:t>
+        <w:t>Uma menina passada de casa em casa, sem ninguém para protegê-la.</w:t>
       </w:r>
     </w:p>
     <w:p>

</xml_diff>

<commit_message>
Marilyn Monroe: revisão geral de retenção e anti-IA, roteiro completo
Co-Authored-By: Claude Opus 5.5 <noreply@anthropic.com>
Claude-Session: https://claude.ai/code/session_01MJjUEEZrxQDEUifKK2vj9g
</commit_message>
<xml_diff>
--- a/roteiros/marilyn-monroe/MarilynMonroe_Parte1_Introducao.docx
+++ b/roteiros/marilyn-monroe/MarilynMonroe_Parte1_Introducao.docx
@@ -311,7 +311,23 @@
         <w:rPr>
           <w:color w:val="000000"/>
         </w:rPr>
-        <w:t>Uma amiga da mãe, Grace McKee, passou a cuidar da vida da menina. Em setembro de mil novecentos e trinta e cinco, Norma Jeane foi levada para o Orfanato de Los Angeles.</w:t>
+        <w:t>Uma amiga da mãe, Grace McKee, passou a cuidar da vida da menina. Grace era apaixonada por cinema. Levava Norma Jeane às salas escuras de Hollywood e repetia que um dia ela ia ser uma estrela, como Jean Harlow, a loira platinada mais famosa da época.</w:t>
+      </w:r>
+    </w:p>
+    <w:p>
+      <w:r>
+        <w:rPr>
+          <w:color w:val="000000"/>
+        </w:rPr>
+        <w:t>A menina acreditou.</w:t>
+      </w:r>
+    </w:p>
+    <w:p>
+      <w:r>
+        <w:rPr>
+          <w:color w:val="000000"/>
+        </w:rPr>
+        <w:t>Só que Grace também não ficou com ela. Em setembro de mil novecentos e trinta e cinco, Norma Jeane foi levada para o Orfanato de Los Angeles.</w:t>
       </w:r>
     </w:p>
     <w:p>

</xml_diff>